<commit_message>
NK41 i NKPXLH: nazwy w ofercie, 2500 kg z dopłatą wpisywaną w wycenie, KOB/GDW standardowo 0,5/2,5%, numer wersji
- oferta: NK41 (dawniej NKPXL/NKPXLT) i NKPXLH; migracja zapisanych szablonów
- wariant 2 na sztukę: pole Dopłata [zł/szt.] w wycenie; bez ceny wariant niedostępny,
  karta 'brak ceny' i opcja w ofercie pokazują komunikat
- KOB i GDW do zmiany w 'Stawki w tej wycenie' (w %); NK41 bez własnych stawek
- wersja programu na pulpicie i w kopii zapasowej

Co-Authored-By: Claude Opus 5.5 <noreply@anthropic.com>
Claude-Session: https://claude.ai/code/session_01XygCrjT9K7zVw2zg8hs3qQ
</commit_message>
<xml_diff>
--- a/kalkulator-nk38/przyklady/Oferta_ul_Kwiatowa_24_Piastow_NKPXLH.docx
+++ b/kalkulator-nk38/przyklady/Oferta_ul_Kwiatowa_24_Piastow_NKPXLH.docx
@@ -12,7 +12,7 @@
           <w:szCs w:val="16"/>
           <w:rFonts w:ascii="Verdana" w:cs="Verdana" w:eastAsia="Verdana" w:hAnsi="Verdana"/>
         </w:rPr>
-        <w:t xml:space="preserve">Kraków, dnia 21.10.2026r.</w:t>
+        <w:t xml:space="preserve">Kraków, dnia 22.10.2026r.</w:t>
       </w:r>
     </w:p>
     <w:p>
@@ -689,7 +689,7 @@
           <w:szCs w:val="16"/>
           <w:rFonts w:ascii="Verdana" w:cs="Verdana" w:eastAsia="Verdana" w:hAnsi="Verdana"/>
         </w:rPr>
-        <w:t xml:space="preserve">NKPXL</w:t>
+        <w:t xml:space="preserve">NKPXLH</w:t>
       </w:r>
       <w:r>
         <w:rPr>

</xml_diff>

<commit_message>
Domyślne KOB 0,515% i GDW 2,685% we wszystkich szablonach, z migracją zapisanych szablonów (wersja 1.44)
Testy zgodności ze starym Excelem liczą z jego stawkami 0,5% / 2,5%.

Co-Authored-By: Claude Opus 5.5 <noreply@anthropic.com>
Claude-Session: https://claude.ai/code/session_01XygCrjT9K7zVw2zg8hs3qQ
</commit_message>
<xml_diff>
--- a/kalkulator-nk38/przyklady/Oferta_ul_Kwiatowa_24_Piastow_NKPXLH.docx
+++ b/kalkulator-nk38/przyklady/Oferta_ul_Kwiatowa_24_Piastow_NKPXLH.docx
@@ -875,7 +875,7 @@
           <w:szCs w:val="16"/>
           <w:rFonts w:ascii="Verdana" w:cs="Verdana" w:eastAsia="Verdana" w:hAnsi="Verdana"/>
         </w:rPr>
-        <w:t xml:space="preserve">377.800,00 zł</w:t>
+        <w:t xml:space="preserve">378.900,00 zł</w:t>
       </w:r>
     </w:p>
     <w:p>
@@ -925,7 +925,7 @@
           <w:szCs w:val="16"/>
           <w:rFonts w:ascii="Verdana" w:cs="Verdana" w:eastAsia="Verdana" w:hAnsi="Verdana"/>
         </w:rPr>
-        <w:t xml:space="preserve">73.500,00 zł</w:t>
+        <w:t xml:space="preserve">73.800,00 zł</w:t>
       </w:r>
     </w:p>
     <w:p>

</xml_diff>